<commit_message>
site: Umbenennungs-Hinweis im Kopf, Versionsangaben präzisiert
Die Seite heißt TurnScript, der Download führt aber bis zum nächsten
Release noch zu LocalTranscript 2.5.0. Ein Satz unter der Versionszeile
sagt das in vier Sprachen. In den acht Blättern steht bei Angaben zur
Version 2.5.0 jetzt «TurnScript (vormals LocalTranscript)», weil 2.5.0
nie unter dem neuen Namen erschienen ist — wichtig vor allem im
Zitiervorschlag für Datenmanagementpläne.

Co-Authored-By: Claude Opus 5 (1M context) <noreply@anthropic.com>
Claude-Session: https://claude.ai/code/session_01VhoDoDyamQwRzZ3dqypMTk
</commit_message>
<xml_diff>
--- a/site/docs/turnscript-data-processing-en.docx
+++ b/site/docs/turnscript-data-processing-en.docx
@@ -28,7 +28,7 @@
         <w:t xml:space="preserve"> </w:t>
       </w:r>
       <w:r>
-        <w:t xml:space="preserve">management plan. As of 13 September 2026, TurnScript 2.5.0. Items</w:t>
+        <w:t xml:space="preserve">management plan. As of 13 September 2026, TurnScript (formerly LocalTranscript) 2.5.0. Items</w:t>
       </w:r>
       <w:r>
         <w:t xml:space="preserve"> </w:t>
@@ -99,7 +99,7 @@
         <w:pStyle w:val="FirstParagraph"/>
       </w:pPr>
       <w:r>
-        <w:t xml:space="preserve">TurnScript, version</w:t>
+        <w:t xml:space="preserve">TurnScript (formerly LocalTranscript), version</w:t>
       </w:r>
       <w:r>
         <w:t xml:space="preserve"> </w:t>

</xml_diff>